<commit_message>
Alinear el sitio y los Términos con la tesis de piezas ficticias (Sprint 3, SC-06)
La portada, las descripciones de productos.json y los Términos v1.0
presentaban las aves como talladas y enviadas, en contradicción con la
Declaración de triple impacto del Sprint 1 (diseños generados con IA, sin
tala de palo santo, especie protegida por CITES y la Ley 26.331).

- Portada, título y pie: «sin talar un árbol»; «Diseños nuevos».
- productos.json: cada descripción es un diseño inspirado en una talla.
- Términos v1.1: cláusula 2 explica que no hay pieza física y que las
  cláusulas de envío, arrepentimiento y garantía rigen en condicional;
  cláusula 4 en condicional; marco normativo con la Ley 26.331 y CITES.
- Registro de cambios (SC-05 aprobada, SC-06) y R12 materializado y corregido.

Co-Authored-By: Claude Opus 5.5 <noreply@anthropic.com>
</commit_message>
<xml_diff>
--- a/docs/sprint-3/01_Terminos_y_Condiciones.docx
+++ b/docs/sprint-3/01_Terminos_y_Condiciones.docx
@@ -985,6 +985,59 @@
                 <w:b/>
                 <w:sz w:val="18"/>
               </w:rPr>
+              <w:t>Ley N° 26.331 y CITES, Apéndice II</w:t>
+            </w:r>
+          </w:p>
+        </w:tc>
+        <w:tc>
+          <w:tcPr>
+            <w:tcW w:type="dxa" w:w="3600"/>
+          </w:tcPr>
+          <w:p>
+            <w:pPr>
+              <w:spacing w:after="0"/>
+            </w:pPr>
+            <w:r>
+              <w:rPr>
+                <w:b w:val="0"/>
+                <w:sz w:val="18"/>
+              </w:rPr>
+              <w:t>Protección de los bosques nativos; el comercio de palo santo exige permisos.</w:t>
+            </w:r>
+          </w:p>
+        </w:tc>
+        <w:tc>
+          <w:tcPr>
+            <w:tcW w:type="dxa" w:w="3600"/>
+          </w:tcPr>
+          <w:p>
+            <w:pPr>
+              <w:spacing w:after="0"/>
+            </w:pPr>
+            <w:r>
+              <w:rPr>
+                <w:b w:val="0"/>
+                <w:sz w:val="18"/>
+              </w:rPr>
+              <w:t>Cláusula 2: las piezas son diseños ficticios. Si se produjeran, sólo con madera de origen legal y trazable.</w:t>
+            </w:r>
+          </w:p>
+        </w:tc>
+      </w:tr>
+      <w:tr>
+        <w:tc>
+          <w:tcPr>
+            <w:tcW w:type="dxa" w:w="2160"/>
+          </w:tcPr>
+          <w:p>
+            <w:pPr>
+              <w:spacing w:after="0"/>
+            </w:pPr>
+            <w:r>
+              <w:rPr>
+                <w:b/>
+                <w:sz w:val="18"/>
+              </w:rPr>
               <w:t>Ley N° 26.993</w:t>
             </w:r>
           </w:p>
@@ -1178,7 +1231,12 @@
     </w:p>
     <w:p>
       <w:r>
-        <w:t>Estos términos están redactados como los de una tienda en funcionamiento, para que el sitio respete desde su diseño las reglas que se aplicarían a una operación real. Si Woodbird comenzara a vender, lo informará en el sitio y publicará una nueva versión de este documento antes de aceptar el primer pedido.</w:t>
+        <w:t>Las piezas del catálogo son diseños ficticios generados con inteligencia artificial, inspirados en el tallado tradicional en maderas nativas del Chaco. No existe una pieza física detrás de cada diseño: Woodbird no tala ni trabaja madera y no envía productos. Esa es la propuesta de triple impacto del proyecto, porque el palo santo es una especie protegida (Apéndice II de la CITES y Ley N° 26.331 de presupuestos mínimos de protección de los bosques nativos).</w:t>
+      </w:r>
+    </w:p>
+    <w:p>
+      <w:r>
+        <w:t>Estos términos están redactados como los de una tienda en funcionamiento, para que el sitio respete desde su diseño las reglas que se aplicarían a una operación real. Las cláusulas sobre productos, envíos, arrepentimiento y garantía describen los derechos que tendría el consumidor si Woodbird produjera y vendiera las piezas. En ese caso, sólo se usaría madera de origen legal y trazable, con las autorizaciones que exigen la Ley N° 26.331 y, para el palo santo, el régimen de la CITES. Si Woodbird comenzara a vender, lo informará en el sitio y publicará una nueva versión de este documento antes de aceptar el primer pedido.</w:t>
       </w:r>
     </w:p>
     <w:p>
@@ -1254,12 +1312,12 @@
     </w:p>
     <w:p>
       <w:r>
-        <w:t>Cada ave se talla a mano en una sola pieza de madera nativa del Chaco: palo santo, algarrobo o quebracho. El catálogo informa para cada pieza su nombre, la madera, la altura en centímetros, una descripción y el precio, conforme al deber de información cierta, clara y detallada del artículo 4 de la Ley N° 24.240.</w:t>
+        <w:t>Cada diseño representa un ave tallada a mano en una sola pieza de madera nativa del Chaco: palo santo, algarrobo o quebracho. El catálogo informa para cada diseño su nombre, la madera que representa, la altura en centímetros, una descripción y el precio, conforme al deber de información cierta, clara y detallada del artículo 4 de la Ley N° 24.240.</w:t>
       </w:r>
     </w:p>
     <w:p>
       <w:r>
-        <w:t>Por tratarse de trabajos artesanales en madera natural, cada pieza es única:</w:t>
+        <w:t>Si las piezas se produjeran, por tratarse de trabajos artesanales en madera natural cada una sería única, y esto se informaría antes de la compra:</w:t>
       </w:r>
     </w:p>
     <w:p>
@@ -1268,7 +1326,7 @@
         <w:spacing w:after="60"/>
       </w:pPr>
       <w:r>
-        <w:t>El dibujo de las vetas y el tono de la madera varían de una pieza a otra y no constituyen un defecto.</w:t>
+        <w:t>El dibujo de las vetas y el tono de la madera variarían de una pieza a otra y no constituirían un defecto.</w:t>
       </w:r>
     </w:p>
     <w:p>
@@ -1277,7 +1335,7 @@
         <w:spacing w:after="60"/>
       </w:pPr>
       <w:r>
-        <w:t>La altura real puede diferir hasta en 1 cm de la informada.</w:t>
+        <w:t>La altura real podría diferir hasta en 1 cm de la informada.</w:t>
       </w:r>
     </w:p>
     <w:p>
@@ -1286,7 +1344,7 @@
         <w:spacing w:after="60"/>
       </w:pPr>
       <w:r>
-        <w:t>El palo santo tiene un aroma propio que se atenúa con el tiempo.</w:t>
+        <w:t>El palo santo tendría un aroma propio que se atenúa con el tiempo.</w:t>
       </w:r>
     </w:p>
     <w:p>
@@ -1531,7 +1589,7 @@
     </w:p>
     <w:p>
       <w:r>
-        <w:t>Para usar la garantía, escriba a contacto@woodbird.com.ar con el número de pedido y una foto del defecto. Woodbird retirará la pieza en su domicilio sin costo. Como cada pieza es única y tallada a mano, si la reparación no es posible o no resulta satisfactoria, el consumidor puede elegir entre el cambio por otra pieza de iguales características, la devolución de lo pagado o una quita proporcional del precio (artículo 17 de la Ley N° 24.240). El tiempo que la pieza esté en reparación se suma al plazo de garantía (artículo 16).</w:t>
+        <w:t>Para usar la garantía, escriba a contacto@woodbird.com.ar con el número de pedido y una foto del defecto. Woodbird retirará la pieza en su domicilio sin costo. Como cada pieza sería única y tallada a mano, si la reparación no es posible o no resulta satisfactoria, el consumidor puede elegir entre el cambio por otra pieza de iguales características, la devolución de lo pagado o una quita proporcional del precio (artículo 17 de la Ley N° 24.240). El tiempo que la pieza esté en reparación se suma al plazo de garantía (artículo 16).</w:t>
       </w:r>
     </w:p>
     <w:p>
@@ -1656,7 +1714,7 @@
     </w:p>
     <w:p>
       <w:r>
-        <w:t>Versión 1.0, vigente desde el 22 de octubre de 2026.</w:t>
+        <w:t>Versión 1.1, vigente desde el 22 de octubre de 2026.</w:t>
       </w:r>
     </w:p>
     <w:p>

</xml_diff>

<commit_message>
Campaña de Instagram y panel de KPIs (Sprint 3, semana 9)
- 05_Campana_de_Instagram: campaña «Sin talar un árbol» con 12 piezas
  (docs/sprint-3/instagram/): 3 imágenes, un carrusel de 5 láminas, 2 de
  producto y 3 historias, cada una con CTA y enlace con UTM al sitio
  publicado, sello «Imagen con IA» y calendario de publicación.
- 06_Panel_de_KPIs: CTR, tasa de conversión simulada, CAC teórico,
  interacción, abandono de carrito y ticket promedio, con fórmula, fuente,
  frecuencia, umbrales y panel visual; supuestos del CAC declarados.
- Las tablas de todos los documentos respetan los anchos de columna en Word.

Co-Authored-By: Claude Opus 5.5 <noreply@anthropic.com>
</commit_message>
<xml_diff>
--- a/docs/sprint-3/01_Terminos_y_Condiciones.docx
+++ b/docs/sprint-3/01_Terminos_y_Condiciones.docx
@@ -322,12 +322,13 @@
       <w:tblPr>
         <w:tblStyle w:val="TableGrid"/>
         <w:tblW w:type="auto" w:w="0"/>
+        <w:tblLayout w:type="fixed"/>
         <w:tblLook w:firstColumn="1" w:firstRow="1" w:lastColumn="0" w:lastRow="0" w:noHBand="0" w:noVBand="1" w:val="04A0"/>
       </w:tblPr>
       <w:tblGrid>
-        <w:gridCol w:w="3120"/>
-        <w:gridCol w:w="3120"/>
-        <w:gridCol w:w="3120"/>
+        <w:gridCol w:w="2160"/>
+        <w:gridCol w:w="3600"/>
+        <w:gridCol w:w="3600"/>
       </w:tblGrid>
       <w:tr>
         <w:tc>
@@ -1742,12 +1743,13 @@
       <w:tblPr>
         <w:tblStyle w:val="TableGrid"/>
         <w:tblW w:type="auto" w:w="0"/>
+        <w:tblLayout w:type="fixed"/>
         <w:tblLook w:firstColumn="1" w:firstRow="1" w:lastColumn="0" w:lastRow="0" w:noHBand="0" w:noVBand="1" w:val="04A0"/>
       </w:tblPr>
       <w:tblGrid>
-        <w:gridCol w:w="3120"/>
-        <w:gridCol w:w="3120"/>
-        <w:gridCol w:w="3120"/>
+        <w:gridCol w:w="3312"/>
+        <w:gridCol w:w="2160"/>
+        <w:gridCol w:w="3888"/>
       </w:tblGrid>
       <w:tr>
         <w:tc>
@@ -2198,12 +2200,13 @@
       <w:tblPr>
         <w:tblStyle w:val="TableGrid"/>
         <w:tblW w:type="auto" w:w="0"/>
+        <w:tblLayout w:type="fixed"/>
         <w:tblLook w:firstColumn="1" w:firstRow="1" w:lastColumn="0" w:lastRow="0" w:noHBand="0" w:noVBand="1" w:val="04A0"/>
       </w:tblPr>
       <w:tblGrid>
-        <w:gridCol w:w="3120"/>
-        <w:gridCol w:w="3120"/>
-        <w:gridCol w:w="3120"/>
+        <w:gridCol w:w="1872"/>
+        <w:gridCol w:w="3744"/>
+        <w:gridCol w:w="3744"/>
       </w:tblGrid>
       <w:tr>
         <w:tc>
@@ -2601,12 +2604,13 @@
       <w:tblPr>
         <w:tblStyle w:val="TableGrid"/>
         <w:tblW w:type="auto" w:w="0"/>
+        <w:tblLayout w:type="fixed"/>
         <w:tblLook w:firstColumn="1" w:firstRow="1" w:lastColumn="0" w:lastRow="0" w:noHBand="0" w:noVBand="1" w:val="04A0"/>
       </w:tblPr>
       <w:tblGrid>
-        <w:gridCol w:w="3120"/>
-        <w:gridCol w:w="3120"/>
-        <w:gridCol w:w="3120"/>
+        <w:gridCol w:w="2160"/>
+        <w:gridCol w:w="3168"/>
+        <w:gridCol w:w="4032"/>
       </w:tblGrid>
       <w:tr>
         <w:tc>

</xml_diff>